<commit_message>
Nr.1 + Tipps verbessert.
</commit_message>
<xml_diff>
--- a/Medien/Informationen HSAB/HSAB Allgemeine Info.docx
+++ b/Medien/Informationen HSAB/HSAB Allgemeine Info.docx
@@ -209,42 +209,97 @@
       <w:r>
         <w:t xml:space="preserve"> </w:t>
       </w:r>
+      <w:r>
+        <w:t>Mg</w:t>
+      </w:r>
+      <w:r>
+        <w:rPr>
+          <w:vertAlign w:val="superscript"/>
+        </w:rPr>
+        <w:t>2+</w:t>
+      </w:r>
+      <w:r>
+        <w:rPr>
+          <w:vertAlign w:val="superscript"/>
+        </w:rPr>
+        <w:t xml:space="preserve"> </w:t>
+      </w:r>
+      <w:r>
+        <w:t>besitzt</w:t>
+      </w:r>
+      <w:r>
+        <w:t xml:space="preserve"> </w:t>
+      </w:r>
+      <w:r>
+        <w:t>kleinen Radius,</w:t>
+      </w:r>
+      <w:r>
+        <w:t xml:space="preserve"> da es sich es in der 2. Periode befindet, und ist geladen. Damit ist</w:t>
+      </w:r>
+      <w:r>
+        <w:t xml:space="preserve"> die Ladungsdichte hoch. Dementsprechend wäre Mg</w:t>
+      </w:r>
+      <w:r>
+        <w:rPr>
+          <w:vertAlign w:val="superscript"/>
+        </w:rPr>
+        <w:t>2+</w:t>
+      </w:r>
+      <w:r>
+        <w:rPr>
+          <w:vertAlign w:val="superscript"/>
+        </w:rPr>
+        <w:t xml:space="preserve"> </w:t>
+      </w:r>
+      <w:r>
+        <w:t>hart.</w:t>
+      </w:r>
     </w:p>
     <w:p>
       <w:r>
-        <w:t>Al</w:t>
-      </w:r>
-      <w:r>
-        <w:rPr>
-          <w:vertAlign w:val="superscript"/>
-        </w:rPr>
-        <w:t>3</w:t>
-      </w:r>
-      <w:r>
-        <w:rPr>
-          <w:vertAlign w:val="superscript"/>
-        </w:rPr>
-        <w:t>+</w:t>
-      </w:r>
-      <w:r>
-        <w:t xml:space="preserve"> hat, weil es 2 Schalen besitzt, einen kleinen Radius und durch die hohe Ladung hat eine sehr hohe Ladungsdichte. Al</w:t>
-      </w:r>
-      <w:r>
-        <w:rPr>
-          <w:vertAlign w:val="superscript"/>
-        </w:rPr>
-        <w:t>3+</w:t>
-      </w:r>
-      <w:r>
-        <w:t xml:space="preserve"> ist dementsprechend hart.</w:t>
-      </w:r>
-      <w:r>
+        <w:t>Cd</w:t>
+      </w:r>
+      <w:r>
+        <w:rPr>
+          <w:vertAlign w:val="superscript"/>
+        </w:rPr>
+        <w:t>2+</w:t>
+      </w:r>
+      <w:r>
+        <w:rPr>
+          <w:vertAlign w:val="superscript"/>
+        </w:rPr>
         <w:t xml:space="preserve"> </w:t>
       </w:r>
-    </w:p>
-    <w:p>
-      <w:r>
-        <w:t>Cd</w:t>
+      <w:r>
+        <w:t xml:space="preserve">hingegen </w:t>
+      </w:r>
+      <w:r>
+        <w:t xml:space="preserve">befindet sich in der 4. Periode, also </w:t>
+      </w:r>
+      <w:r>
+        <w:t>hat einen deutlich größeren Ionenradius</w:t>
+      </w:r>
+      <w:r>
+        <w:t>. Da</w:t>
+      </w:r>
+      <w:r>
+        <w:t xml:space="preserve"> es dieselbe </w:t>
+      </w:r>
+      <w:r>
+        <w:t>Ladung</w:t>
+      </w:r>
+      <w:r>
+        <w:t xml:space="preserve"> besitzt</w:t>
+      </w:r>
+      <w:r>
+        <w:t xml:space="preserve">, </w:t>
+      </w:r>
+      <w:r>
+        <w:t>ergibt sich somit eine geringe</w:t>
+      </w:r>
+      <w:r>
+        <w:t xml:space="preserve"> Ladungsdichte. Cd</w:t>
       </w:r>
       <w:r>
         <w:rPr>
@@ -253,60 +308,10 @@
         <w:t>2+</w:t>
       </w:r>
       <w:r>
-        <w:rPr>
-          <w:vertAlign w:val="superscript"/>
-        </w:rPr>
+        <w:t xml:space="preserve"> ist dementsprechend weich.</w:t>
+      </w:r>
+      <w:r>
         <w:t xml:space="preserve"> </w:t>
-      </w:r>
-      <w:r>
-        <w:t>hingegen hat einen deutlich größeren Ionenradius mit 4 Schalen und eine mittlere Ladung, womit die Ladungsdichte gering ist. Cd</w:t>
-      </w:r>
-      <w:r>
-        <w:rPr>
-          <w:vertAlign w:val="superscript"/>
-        </w:rPr>
-        <w:t>2+</w:t>
-      </w:r>
-      <w:r>
-        <w:t xml:space="preserve"> ist dementsprechend weich.</w:t>
-      </w:r>
-      <w:r>
-        <w:t xml:space="preserve"> </w:t>
-      </w:r>
-    </w:p>
-    <w:p>
-      <w:r>
-        <w:t>Mg</w:t>
-      </w:r>
-      <w:r>
-        <w:rPr>
-          <w:vertAlign w:val="superscript"/>
-        </w:rPr>
-        <w:t>2+</w:t>
-      </w:r>
-      <w:r>
-        <w:rPr>
-          <w:vertAlign w:val="superscript"/>
-        </w:rPr>
-        <w:t xml:space="preserve"> </w:t>
-      </w:r>
-      <w:r>
-        <w:t>jedoch besitzt wiederum einen so kleinen Radius mit zwei Schalen, dass die Ladungsdichte hoch ist. Dementsprechend wäre Mg</w:t>
-      </w:r>
-      <w:r>
-        <w:rPr>
-          <w:vertAlign w:val="superscript"/>
-        </w:rPr>
-        <w:t>2+</w:t>
-      </w:r>
-      <w:r>
-        <w:rPr>
-          <w:vertAlign w:val="superscript"/>
-        </w:rPr>
-        <w:t xml:space="preserve"> </w:t>
-      </w:r>
-      <w:r>
-        <w:t>hart.</w:t>
       </w:r>
     </w:p>
     <w:p>
@@ -472,7 +477,13 @@
         </w:numPr>
       </w:pPr>
       <w:r>
-        <w:t>… schlechter die Polarisierbarkeit (abhängig von der Elektronegativität und Molekülgeometrie).</w:t>
+        <w:t>… schlechter die Polarisierbarkeit (</w:t>
+      </w:r>
+      <w:r>
+        <w:t xml:space="preserve">= wie sehr reagiert ein Molekül/Ion auf äußere elektrische Einwirkungen. Unter anderem </w:t>
+      </w:r>
+      <w:r>
+        <w:t>abhängig von der Elektronegativität und Molekülgeometrie).</w:t>
       </w:r>
     </w:p>
     <w:p>
@@ -480,7 +491,72 @@
         <w:t>Bsp.:</w:t>
       </w:r>
       <w:r>
-        <w:t xml:space="preserve"> NH</w:t>
+        <w:t xml:space="preserve"> </w:t>
+      </w:r>
+      <w:r>
+        <w:t>F</w:t>
+      </w:r>
+      <w:r>
+        <w:rPr>
+          <w:vertAlign w:val="superscript"/>
+        </w:rPr>
+        <w:t>-</w:t>
+      </w:r>
+      <w:r>
+        <w:t xml:space="preserve"> </w:t>
+      </w:r>
+      <w:r>
+        <w:t xml:space="preserve">(hart) </w:t>
+      </w:r>
+      <w:r>
+        <w:t>ist schlechter polarisierbar als I</w:t>
+      </w:r>
+      <w:r>
+        <w:rPr>
+          <w:vertAlign w:val="superscript"/>
+        </w:rPr>
+        <w:t>-</w:t>
+      </w:r>
+      <w:r>
+        <w:rPr>
+          <w:vertAlign w:val="superscript"/>
+        </w:rPr>
+        <w:t xml:space="preserve"> </w:t>
+      </w:r>
+      <w:r>
+        <w:t xml:space="preserve">(weich). Denn die Elektronen der Valenzschale </w:t>
+      </w:r>
+      <w:r>
+        <w:t>beim F</w:t>
+      </w:r>
+      <w:r>
+        <w:rPr>
+          <w:vertAlign w:val="superscript"/>
+        </w:rPr>
+        <w:t>-</w:t>
+      </w:r>
+      <w:r>
+        <w:rPr>
+          <w:vertAlign w:val="superscript"/>
+        </w:rPr>
+        <w:t xml:space="preserve"> </w:t>
+      </w:r>
+      <w:r>
+        <w:t>sind deutlich näher am Kern als bei I</w:t>
+      </w:r>
+      <w:r>
+        <w:rPr>
+          <w:vertAlign w:val="superscript"/>
+        </w:rPr>
+        <w:t>-</w:t>
+      </w:r>
+      <w:r>
+        <w:t xml:space="preserve"> und somit weniger beeinflussbar durch äußere Ladungseinflüsse (z.B. ein anderes Ion).</w:t>
+      </w:r>
+    </w:p>
+    <w:p>
+      <w:r>
+        <w:t>NH</w:t>
       </w:r>
       <w:r>
         <w:rPr>
@@ -498,13 +574,13 @@
         <w:t>3</w:t>
       </w:r>
       <w:r>
-        <w:t xml:space="preserve"> als weiche Base gilt. Denn beide haben eine t</w:t>
-      </w:r>
-      <w:r>
-        <w:t>rigonal-pyramidale</w:t>
-      </w:r>
-      <w:r>
-        <w:t xml:space="preserve"> Struktur, und sind damit prinzipiell polarisierbar. Aufgrund der hohen </w:t>
+        <w:t xml:space="preserve"> als weiche Base gilt. </w:t>
+      </w:r>
+      <w:r>
+        <w:t>Beide sind</w:t>
+      </w:r>
+      <w:r>
+        <w:t xml:space="preserve"> prinzipiell polarisierbar. Aufgrund der hohen </w:t>
       </w:r>
       <w:r>
         <w:t>∆EN(</w:t>
@@ -528,7 +604,7 @@
         <w:t xml:space="preserve">)= </w:t>
       </w:r>
       <w:r>
-        <w:t>2,2, und der geringeren Größe von Stickstoff in Vergleich zu Phosphor, liegt der Ladungsschwerpunkt innerhalb der Moleküle deutlich mehr beim N als es beim P der Fall ist.</w:t>
+        <w:t>2,2, und der geringeren Größe von Stickstoff in Vergleich zu Phosphor, liegt der Ladungsschwerpunkt innerhalb der Moleküle deutlich mehr beim N als bei P.</w:t>
       </w:r>
       <w:r>
         <w:t xml:space="preserve"> Das führt zu einer schlechteres Polarisierbarkeit von NH</w:t>

</xml_diff>